<commit_message>
Align subscription naming + pricing with the real catalog
- Three named tiers: L'Étincelle ✨ (1 mois / 18,90 € / mois),
  Le Lien 🧡 (3 mois / 15,50 € / mois, −18 %, 46,50 € tous les 3 mois),
  La Bande 👯 (6 mois / 12,50 € / mois, −34 %, 75 € tous les 6 mois)
- subscribe.tsx: plan shape now uses `name` + `promise` + pricing lines,
  highlighted card flips to La Bande with "Le plus choisi" badge
- SubscriptionSheet: recurring amount lifted to 12,50 € to match the
  default La Bande plan
- Proposal doc (§ 3 bis): pricing table, comparison row "from 12,50 €",
  app blurb all updated; DOCX regenerated
</commit_message>
<xml_diff>
--- a/docs/proposition-marguerite.docx
+++ b/docs/proposition-marguerite.docx
@@ -2179,13 +2179,13 @@
       </w:r>
     </w:p>
     <w:bookmarkEnd w:id="24"/>
-    <w:bookmarkStart w:id="25" w:name="les-formules-payantes-membre-du-club"/>
+    <w:bookmarkStart w:id="25" w:name="X2668a66f9bfa7cb53235b83c3d43caf61975858"/>
     <w:p>
       <w:pPr>
         <w:pStyle w:val="Heading3"/>
       </w:pPr>
       <w:r>
-        <w:t xml:space="preserve">Les formules payantes — Membre du club</w:t>
+        <w:t xml:space="preserve">Les formules payantes — trois portes d’entrée au club</w:t>
       </w:r>
     </w:p>
     <w:p>
@@ -2193,26 +2193,35 @@
         <w:pStyle w:val="FirstParagraph"/>
       </w:pPr>
       <w:r>
-        <w:t xml:space="preserve">Même périmètre de fonctionnalités quel que soit l’engagement, seul le prix</w:t>
-      </w:r>
-      <w:r>
-        <w:t xml:space="preserve"> </w:t>
-      </w:r>
-      <w:r>
-        <w:t xml:space="preserve">au mois change selon la durée.</w:t>
+        <w:t xml:space="preserve">Trois formules nommées comme trois moments d’une même histoire :</w:t>
+      </w:r>
+      <w:r>
+        <w:t xml:space="preserve"> </w:t>
+      </w:r>
+      <w:r>
+        <w:t xml:space="preserve">découvrir, rencontrer, s’entourer. Même périmètre de fonctionnalités dans</w:t>
+      </w:r>
+      <w:r>
+        <w:t xml:space="preserve"> </w:t>
+      </w:r>
+      <w:r>
+        <w:t xml:space="preserve">les trois cas — seule la durée d’engagement et le prix au mois changent.</w:t>
       </w:r>
     </w:p>
     <w:tbl>
       <w:tblPr>
         <w:tblStyle w:val="Table"/>
-        <w:tblW w:type="auto" w:w="0"/>
+        <w:tblW w:type="pct" w:w="5000"/>
+        <w:tblLayout w:type="fixed"/>
         <w:tblLook w:firstRow="1" w:lastRow="0" w:firstColumn="0" w:lastColumn="0" w:noHBand="0" w:noVBand="0" w:val="0020"/>
       </w:tblPr>
       <w:tblGrid>
-        <w:gridCol w:w="1980"/>
-        <w:gridCol w:w="1980"/>
-        <w:gridCol w:w="1980"/>
-        <w:gridCol w:w="1980"/>
+        <w:gridCol w:w="1320"/>
+        <w:gridCol w:w="1320"/>
+        <w:gridCol w:w="1320"/>
+        <w:gridCol w:w="1320"/>
+        <w:gridCol w:w="1320"/>
+        <w:gridCol w:w="1320"/>
       </w:tblGrid>
       <w:tr>
         <w:trPr>
@@ -2236,7 +2245,18 @@
               <w:pStyle w:val="Compact"/>
             </w:pPr>
             <w:r>
-              <w:t xml:space="preserve">Prix total</w:t>
+              <w:t xml:space="preserve">Promesse</w:t>
+            </w:r>
+          </w:p>
+        </w:tc>
+        <w:tc>
+          <w:tcPr/>
+          <w:p>
+            <w:pPr>
+              <w:pStyle w:val="Compact"/>
+            </w:pPr>
+            <w:r>
+              <w:t xml:space="preserve">Durée</w:t>
             </w:r>
           </w:p>
         </w:tc>
@@ -2248,6 +2268,17 @@
             </w:pPr>
             <w:r>
               <w:t xml:space="preserve">Prix / mois</w:t>
+            </w:r>
+          </w:p>
+        </w:tc>
+        <w:tc>
+          <w:tcPr/>
+          <w:p>
+            <w:pPr>
+              <w:pStyle w:val="Compact"/>
+            </w:pPr>
+            <w:r>
+              <w:t xml:space="preserve">Facturation</w:t>
             </w:r>
           </w:p>
         </w:tc>
@@ -2275,35 +2306,51 @@
                 <w:b/>
                 <w:bCs/>
               </w:rPr>
-              <w:t xml:space="preserve">Mensuel</w:t>
-            </w:r>
-            <w:r>
-              <w:t xml:space="preserve"> </w:t>
-            </w:r>
-            <w:r>
-              <w:t xml:space="preserve">(sans engagement)</w:t>
-            </w:r>
-          </w:p>
-        </w:tc>
-        <w:tc>
-          <w:tcPr/>
-          <w:p>
-            <w:pPr>
-              <w:pStyle w:val="Compact"/>
-            </w:pPr>
-            <w:r>
-              <w:t xml:space="preserve">9,99 €</w:t>
-            </w:r>
-          </w:p>
-        </w:tc>
-        <w:tc>
-          <w:tcPr/>
-          <w:p>
-            <w:pPr>
-              <w:pStyle w:val="Compact"/>
-            </w:pPr>
-            <w:r>
-              <w:t xml:space="preserve">9,99 €</w:t>
+              <w:t xml:space="preserve">L’Étincelle ✨</w:t>
+            </w:r>
+          </w:p>
+        </w:tc>
+        <w:tc>
+          <w:tcPr/>
+          <w:p>
+            <w:pPr>
+              <w:pStyle w:val="Compact"/>
+            </w:pPr>
+            <w:r>
+              <w:t xml:space="preserve">Pour découvrir le concept</w:t>
+            </w:r>
+          </w:p>
+        </w:tc>
+        <w:tc>
+          <w:tcPr/>
+          <w:p>
+            <w:pPr>
+              <w:pStyle w:val="Compact"/>
+            </w:pPr>
+            <w:r>
+              <w:t xml:space="preserve">1 mois</w:t>
+            </w:r>
+          </w:p>
+        </w:tc>
+        <w:tc>
+          <w:tcPr/>
+          <w:p>
+            <w:pPr>
+              <w:pStyle w:val="Compact"/>
+            </w:pPr>
+            <w:r>
+              <w:t xml:space="preserve">18,90 €</w:t>
+            </w:r>
+          </w:p>
+        </w:tc>
+        <w:tc>
+          <w:tcPr/>
+          <w:p>
+            <w:pPr>
+              <w:pStyle w:val="Compact"/>
+            </w:pPr>
+            <w:r>
+              <w:t xml:space="preserve">18,90 € / mois</w:t>
             </w:r>
           </w:p>
         </w:tc>
@@ -2331,6 +2378,28 @@
                 <w:b/>
                 <w:bCs/>
               </w:rPr>
+              <w:t xml:space="preserve">Le Lien 🧡</w:t>
+            </w:r>
+          </w:p>
+        </w:tc>
+        <w:tc>
+          <w:tcPr/>
+          <w:p>
+            <w:pPr>
+              <w:pStyle w:val="Compact"/>
+            </w:pPr>
+            <w:r>
+              <w:t xml:space="preserve">Pour rencontrer ta prochaine acolyte</w:t>
+            </w:r>
+          </w:p>
+        </w:tc>
+        <w:tc>
+          <w:tcPr/>
+          <w:p>
+            <w:pPr>
+              <w:pStyle w:val="Compact"/>
+            </w:pPr>
+            <w:r>
               <w:t xml:space="preserve">3 mois</w:t>
             </w:r>
           </w:p>
@@ -2342,34 +2411,10 @@
               <w:pStyle w:val="Compact"/>
             </w:pPr>
             <w:r>
-              <w:t xml:space="preserve">24,99 €</w:t>
-            </w:r>
-          </w:p>
-        </w:tc>
-        <w:tc>
-          <w:tcPr/>
-          <w:p>
-            <w:pPr>
-              <w:pStyle w:val="Compact"/>
-            </w:pPr>
-            <w:r>
-              <w:t xml:space="preserve">8,33 €</w:t>
-            </w:r>
-          </w:p>
-        </w:tc>
-        <w:tc>
-          <w:tcPr/>
-          <w:p>
-            <w:pPr>
-              <w:pStyle w:val="Compact"/>
-            </w:pPr>
-            <w:r>
-              <w:t xml:space="preserve">−17 %</w:t>
-            </w:r>
-          </w:p>
-        </w:tc>
-      </w:tr>
-      <w:tr>
+              <w:t xml:space="preserve">15,50 €</w:t>
+            </w:r>
+          </w:p>
+        </w:tc>
         <w:tc>
           <w:tcPr/>
           <w:p>
@@ -2381,6 +2426,60 @@
                 <w:b/>
                 <w:bCs/>
               </w:rPr>
+              <w:t xml:space="preserve">46,50 € tous les 3 mois</w:t>
+            </w:r>
+          </w:p>
+        </w:tc>
+        <w:tc>
+          <w:tcPr/>
+          <w:p>
+            <w:pPr>
+              <w:pStyle w:val="Compact"/>
+            </w:pPr>
+            <w:r>
+              <w:rPr>
+                <w:b/>
+                <w:bCs/>
+              </w:rPr>
+              <w:t xml:space="preserve">−18 %</w:t>
+            </w:r>
+          </w:p>
+        </w:tc>
+      </w:tr>
+      <w:tr>
+        <w:tc>
+          <w:tcPr/>
+          <w:p>
+            <w:pPr>
+              <w:pStyle w:val="Compact"/>
+            </w:pPr>
+            <w:r>
+              <w:rPr>
+                <w:b/>
+                <w:bCs/>
+              </w:rPr>
+              <w:t xml:space="preserve">La Bande 👯</w:t>
+            </w:r>
+          </w:p>
+        </w:tc>
+        <w:tc>
+          <w:tcPr/>
+          <w:p>
+            <w:pPr>
+              <w:pStyle w:val="Compact"/>
+            </w:pPr>
+            <w:r>
+              <w:t xml:space="preserve">Pour te constituer ton gang de copines</w:t>
+            </w:r>
+          </w:p>
+        </w:tc>
+        <w:tc>
+          <w:tcPr/>
+          <w:p>
+            <w:pPr>
+              <w:pStyle w:val="Compact"/>
+            </w:pPr>
+            <w:r>
               <w:t xml:space="preserve">6 mois</w:t>
             </w:r>
           </w:p>
@@ -2392,29 +2491,37 @@
               <w:pStyle w:val="Compact"/>
             </w:pPr>
             <w:r>
-              <w:t xml:space="preserve">39,99 €</w:t>
-            </w:r>
-          </w:p>
-        </w:tc>
-        <w:tc>
-          <w:tcPr/>
-          <w:p>
-            <w:pPr>
-              <w:pStyle w:val="Compact"/>
-            </w:pPr>
-            <w:r>
-              <w:t xml:space="preserve">6,66 €</w:t>
-            </w:r>
-          </w:p>
-        </w:tc>
-        <w:tc>
-          <w:tcPr/>
-          <w:p>
-            <w:pPr>
-              <w:pStyle w:val="Compact"/>
-            </w:pPr>
-            <w:r>
-              <w:t xml:space="preserve">−33 %</w:t>
+              <w:t xml:space="preserve">12,50 €</w:t>
+            </w:r>
+          </w:p>
+        </w:tc>
+        <w:tc>
+          <w:tcPr/>
+          <w:p>
+            <w:pPr>
+              <w:pStyle w:val="Compact"/>
+            </w:pPr>
+            <w:r>
+              <w:rPr>
+                <w:b/>
+                <w:bCs/>
+              </w:rPr>
+              <w:t xml:space="preserve">75 € tous les 6 mois</w:t>
+            </w:r>
+          </w:p>
+        </w:tc>
+        <w:tc>
+          <w:tcPr/>
+          <w:p>
+            <w:pPr>
+              <w:pStyle w:val="Compact"/>
+            </w:pPr>
+            <w:r>
+              <w:rPr>
+                <w:b/>
+                <w:bCs/>
+              </w:rPr>
+              <w:t xml:space="preserve">−34 %</w:t>
             </w:r>
           </w:p>
         </w:tc>
@@ -2441,13 +2548,13 @@
         <w:t xml:space="preserve"> </w:t>
       </w:r>
       <w:r>
-        <w:t xml:space="preserve">pour les formules 3 et 6 mois (trésorerie</w:t>
-      </w:r>
-      <w:r>
-        <w:t xml:space="preserve"> </w:t>
-      </w:r>
-      <w:r>
-        <w:t xml:space="preserve">immédiate pour toi, meilleur deal pour la fille).</w:t>
+        <w:t xml:space="preserve">pour Le Lien et La Bande (trésorerie</w:t>
+      </w:r>
+      <w:r>
+        <w:t xml:space="preserve"> </w:t>
+      </w:r>
+      <w:r>
+        <w:t xml:space="preserve">immédiate pour ta société, meilleur deal au mois pour la fille).</w:t>
       </w:r>
     </w:p>
     <w:p>
@@ -2862,7 +2969,7 @@
               <w:t xml:space="preserve"> </w:t>
             </w:r>
             <w:r>
-              <w:t xml:space="preserve">(à partir de 6,66 €/mois)</w:t>
+              <w:t xml:space="preserve">(à partir de 12,50 €/mois)</w:t>
             </w:r>
           </w:p>
         </w:tc>
@@ -3430,31 +3537,41 @@
         <w:t xml:space="preserve"> </w:t>
       </w:r>
       <w:r>
-        <w:t xml:space="preserve">s’affichent ensemble sur l’écran</w:t>
-      </w:r>
-      <w:r>
-        <w:t xml:space="preserve"> </w:t>
-      </w:r>
-      <w:r>
-        <w:rPr>
-          <w:rStyle w:val="VerbatimChar"/>
-        </w:rPr>
-        <w:t xml:space="preserve">/subscribe</w:t>
-      </w:r>
-      <w:r>
-        <w:t xml:space="preserve">, avec</w:t>
-      </w:r>
-      <w:r>
-        <w:t xml:space="preserve"> </w:t>
-      </w:r>
-      <w:r>
-        <w:t xml:space="preserve">la 6 mois mise en avant (</w:t>
+        <w:t xml:space="preserve">s’affichent ensemble sur l’écran d’abonnement,</w:t>
+      </w:r>
+      <w:r>
+        <w:t xml:space="preserve"> </w:t>
+      </w:r>
+      <w:r>
+        <w:t xml:space="preserve">avec</w:t>
+      </w:r>
+      <w:r>
+        <w:t xml:space="preserve"> </w:t>
+      </w:r>
+      <w:r>
+        <w:rPr>
+          <w:b/>
+          <w:bCs/>
+        </w:rPr>
+        <w:t xml:space="preserve">La Bande</w:t>
+      </w:r>
+      <w:r>
+        <w:t xml:space="preserve"> </w:t>
+      </w:r>
+      <w:r>
+        <w:t xml:space="preserve">mise en avant (</w:t>
       </w:r>
       <w:r>
         <w:t xml:space="preserve">“le plus choisi”</w:t>
       </w:r>
       <w:r>
-        <w:t xml:space="preserve">, économie soulignée).</w:t>
+        <w:t xml:space="preserve">, économie −34 %</w:t>
+      </w:r>
+      <w:r>
+        <w:t xml:space="preserve"> </w:t>
+      </w:r>
+      <w:r>
+        <w:t xml:space="preserve">soulignée).</w:t>
       </w:r>
     </w:p>
     <w:p>
@@ -3482,13 +3599,13 @@
         <w:t xml:space="preserve"> </w:t>
       </w:r>
       <w:r>
-        <w:t xml:space="preserve">est possible en un clic depuis le profil (on n’est pas</w:t>
-      </w:r>
-      <w:r>
-        <w:t xml:space="preserve"> </w:t>
-      </w:r>
-      <w:r>
-        <w:t xml:space="preserve">là pour retenir les filles contre leur gré — ça protège la marque).</w:t>
+        <w:t xml:space="preserve">est possible en un clic depuis le profil (on n’est</w:t>
+      </w:r>
+      <w:r>
+        <w:t xml:space="preserve"> </w:t>
+      </w:r>
+      <w:r>
+        <w:t xml:space="preserve">pas là pour retenir les filles contre leur gré — ça protège la marque).</w:t>
       </w:r>
     </w:p>
     <w:p>
@@ -3500,13 +3617,13 @@
         </w:numPr>
       </w:pPr>
       <w:r>
-        <w:t xml:space="preserve">Les relances de fin d’engagement 3/6 mois sont gérées automatiquement</w:t>
-      </w:r>
-      <w:r>
-        <w:t xml:space="preserve"> </w:t>
-      </w:r>
-      <w:r>
-        <w:t xml:space="preserve">via</w:t>
+        <w:t xml:space="preserve">Les relances de fin d’engagement pour Le Lien et La Bande sont gérées</w:t>
+      </w:r>
+      <w:r>
+        <w:t xml:space="preserve"> </w:t>
+      </w:r>
+      <w:r>
+        <w:t xml:space="preserve">automatiquement via</w:t>
       </w:r>
       <w:r>
         <w:t xml:space="preserve"> </w:t>
@@ -3522,7 +3639,13 @@
         <w:t xml:space="preserve"> </w:t>
       </w:r>
       <w:r>
-        <w:t xml:space="preserve">(email J-7, J-2, J-0 avec proposition de renouvellement).</w:t>
+        <w:t xml:space="preserve">(email J-7, J-2, J-0 avec proposition de</w:t>
+      </w:r>
+      <w:r>
+        <w:t xml:space="preserve"> </w:t>
+      </w:r>
+      <w:r>
+        <w:t xml:space="preserve">renouvellement).</w:t>
       </w:r>
     </w:p>
     <w:p>

</xml_diff>

<commit_message>
Clean up stale 9,99 € pricing references
- ClubUpsellCard: À partir de 9,99 €/mois → À partir de 12,50 €/mois
  trois formules (reflects the new named tiers L'Étincelle / Le Lien /
  La Bande)
- Proposal doc § 7.4: Stripe section now points to the three tiers
  instead of a single 9,99 € monthly plan, DOCX regenerated
- PaywallOverlay: centre the background preview so the avatars sit
  concentrically behind the locked CTA instead of clumping top-left
</commit_message>
<xml_diff>
--- a/docs/proposition-marguerite.docx
+++ b/docs/proposition-marguerite.docx
@@ -6485,7 +6485,13 @@
         <w:t xml:space="preserve"> </w:t>
       </w:r>
       <w:r>
-        <w:t xml:space="preserve">pour l’abonnement mensuel (9,99 €).</w:t>
+        <w:t xml:space="preserve">pour les trois formules d’abonnement</w:t>
+      </w:r>
+      <w:r>
+        <w:t xml:space="preserve"> </w:t>
+      </w:r>
+      <w:r>
+        <w:t xml:space="preserve">(L’Étincelle / Le Lien / La Bande — voir § 3 bis pour les tarifs).</w:t>
       </w:r>
     </w:p>
     <w:p>

</xml_diff>